<commit_message>
Updated Bible resource content and metadata for multiple languages on 2026-05-06 release
</commit_message>
<xml_diff>
--- a/eng/docx/001.content.docx
+++ b/eng/docx/001.content.docx
@@ -19,7 +19,7 @@
         <w:rPr>
           <w:lang w:val="en_US" w:bidi="en_US"/>
         </w:rPr>
-        <w:t>Resource: Videos (Video Bible Dictionary)</w:t>
+        <w:t>Resource: Video Bible Dictionary</w:t>
       </w:r>
       <w:r>
         <w:rPr>
@@ -90,7 +90,7 @@
         <w:rPr>
           <w:lang w:val="en_US" w:bidi="en_US"/>
         </w:rPr>
-        <w:t>Videos (Video Bible Dictionary)</w:t>
+        <w:t>Video Bible Dictionary</w:t>
       </w:r>
     </w:p>
     <w:p>

</xml_diff>